<commit_message>
Some Changes in project paper and we also check with longer data set.
</commit_message>
<xml_diff>
--- a/source/Samples/ApprovedMultiSequenceLearningNew/Documentation/Approve Prediction of Multisequence Learning_Git_Gurdians-Paper.docx
+++ b/source/Samples/ApprovedMultiSequenceLearningNew/Documentation/Approve Prediction of Multisequence Learning_Git_Gurdians-Paper.docx
@@ -21,14 +21,7 @@
           <w:sz w:val="40"/>
           <w:szCs w:val="40"/>
         </w:rPr>
-        <w:t>ML-23/24-09</w:t>
-      </w:r>
-      <w:r>
-        <w:rPr>
-          <w:sz w:val="40"/>
-          <w:szCs w:val="40"/>
-        </w:rPr>
-        <w:t xml:space="preserve"> </w:t>
+        <w:t xml:space="preserve">ML-23/24-09 </w:t>
       </w:r>
       <w:r>
         <w:rPr>
@@ -1048,7 +1041,19 @@
         <w:rPr>
           <w:color w:val="000000"/>
         </w:rPr>
-        <w:t xml:space="preserve">In contrast, the human brain utilizes a method called Sparse Distributed Representation (SDR) to encode information. SDRs play a central role </w:t>
+        <w:t xml:space="preserve">In contrast, the human brain utilizes a method called Sparse Distributed Representation (SDR) to encode information. SDRs play </w:t>
+      </w:r>
+      <w:r>
+        <w:rPr>
+          <w:color w:val="000000"/>
+        </w:rPr>
+        <w:t>a significant role</w:t>
+      </w:r>
+      <w:r>
+        <w:rPr>
+          <w:color w:val="000000"/>
+        </w:rPr>
+        <w:t xml:space="preserve"> </w:t>
       </w:r>
       <w:r>
         <w:rPr>
@@ -1550,6 +1555,82 @@
     </w:p>
     <w:p>
       <w:pPr>
+        <w:jc w:val="both"/>
+      </w:pPr>
+      <w:r>
+        <w:rPr>
+          <w:rFonts w:eastAsia="Times New Roman"/>
+        </w:rPr>
+        <w:t xml:space="preserve">Actually, the prediction works like </w:t>
+      </w:r>
+      <w:r>
+        <w:t>at</w:t>
+      </w:r>
+      <w:r>
+        <w:t> inference the Predictor wrapper carries out a forward pass of the trained HTM pipeline but without learning: the current integer is first converted into a sparse distributed representation by the scalar encoder</w:t>
+      </w:r>
+      <w:r>
+        <w:t>.</w:t>
+      </w:r>
+      <w:r>
+        <w:t> </w:t>
+      </w:r>
+      <w:r>
+        <w:t>T</w:t>
+      </w:r>
+      <w:r>
+        <w:t>hat SDR is mapped by the spatial pooler onto a stable subset of active columns, and the temporal-memory module</w:t>
+      </w:r>
+      <w:r>
+        <w:t xml:space="preserve"> </w:t>
+      </w:r>
+      <w:r>
+        <w:t>using distal synapses learned at training</w:t>
+      </w:r>
+      <w:r>
+        <w:t xml:space="preserve"> </w:t>
+      </w:r>
+      <w:r>
+        <w:t>marks out the cells predicted to become active one step on this set of predictive cells is then passed to the lightweight HTM classifier</w:t>
+      </w:r>
+      <w:r>
+        <w:t>.</w:t>
+      </w:r>
+      <w:r>
+        <w:t xml:space="preserve"> </w:t>
+      </w:r>
+      <w:r>
+        <w:t>W</w:t>
+      </w:r>
+      <w:r>
+        <w:t>hich consults the lookup table it built at training and returns the label string most closely matching the current cellular pattern the code then parses</w:t>
+      </w:r>
+      <w:r>
+        <w:t xml:space="preserve"> </w:t>
+      </w:r>
+      <w:r>
+        <w:t>the final token</w:t>
+      </w:r>
+      <w:r>
+        <w:t xml:space="preserve"> </w:t>
+      </w:r>
+      <w:r>
+        <w:t>of that label to produce the predicted next integer, so the predicted value is simply the one which historically followed the same neural context most often in the training data​.</w:t>
+      </w:r>
+    </w:p>
+    <w:p>
+      <w:pPr>
+        <w:pStyle w:val="BodyText"/>
+        <w:spacing w:line="240" w:lineRule="auto"/>
+        <w:ind w:firstLine="0"/>
+        <w:rPr>
+          <w:rFonts w:eastAsia="Times New Roman"/>
+          <w:lang w:val="en-US"/>
+        </w:rPr>
+      </w:pPr>
+    </w:p>
+    <w:p>
+      <w:pPr>
         <w:pStyle w:val="BodyText"/>
         <w:ind w:firstLine="0"/>
         <w:rPr>
@@ -1718,7 +1799,13 @@
         <w:rPr>
           <w:rFonts w:eastAsia="Times New Roman"/>
         </w:rPr>
-        <w:t xml:space="preserve">Our dataset is an organized list of sequential data in the form of JSON, and every entry consists of a labeled sequence of digits or characters compiled by systematic study and observation. Each sequence is framed to detect underlying trends and patterns, and they form the groundwork for our input to the Multi Sequence Learning project. This data set is not just filled with raw numerical or categorical information but also holds </w:t>
+        <w:t xml:space="preserve">Our dataset is an organized list of sequential data in the form of JSON, and every entry consists of a labeled sequence of digits or characters compiled by systematic study and observation. Each sequence is framed to detect underlying </w:t>
+      </w:r>
+      <w:r>
+        <w:rPr>
+          <w:rFonts w:eastAsia="Times New Roman"/>
+        </w:rPr>
+        <w:t xml:space="preserve">trends and patterns, and they form the groundwork for our input to the Multi Sequence Learning project. This data set is not just filled with raw numerical or categorical information but also holds </w:t>
       </w:r>
       <w:r>
         <w:rPr>
@@ -1836,9 +1923,9 @@
           <w:bdr w:val="none" w:sz="0" w:space="0" w:color="auto" w:frame="1"/>
         </w:rPr>
         <w:drawing>
-          <wp:inline distT="0" distB="0" distL="0" distR="0" wp14:anchorId="09100376" wp14:editId="5F11A7C6">
-            <wp:extent cx="2725673" cy="1741336"/>
-            <wp:effectExtent l="0" t="0" r="0" b="0"/>
+          <wp:inline distT="0" distB="0" distL="0" distR="0" wp14:anchorId="09100376" wp14:editId="11F673C8">
+            <wp:extent cx="2725413" cy="1480782"/>
+            <wp:effectExtent l="0" t="0" r="0" b="5715"/>
             <wp:docPr id="1345980135" name="Picture 4" descr="A grid of numbers and letters&#10;&#10;AI-generated content may be incorrect."/>
             <wp:cNvGraphicFramePr>
               <a:graphicFrameLocks xmlns:a="http://schemas.openxmlformats.org/drawingml/2006/main" noChangeAspect="1"/>
@@ -1868,7 +1955,7 @@
                   <pic:spPr bwMode="auto">
                     <a:xfrm>
                       <a:off x="0" y="0"/>
-                      <a:ext cx="2745189" cy="1753804"/>
+                      <a:ext cx="2762085" cy="1500707"/>
                     </a:xfrm>
                     <a:prstGeom prst="rect">
                       <a:avLst/>
@@ -1937,9 +2024,9 @@
           <w:bdr w:val="none" w:sz="0" w:space="0" w:color="auto" w:frame="1"/>
         </w:rPr>
         <w:drawing>
-          <wp:inline distT="0" distB="0" distL="0" distR="0" wp14:anchorId="1DFE73F2" wp14:editId="6148FF6A">
-            <wp:extent cx="3004185" cy="1709530"/>
-            <wp:effectExtent l="0" t="0" r="5715" b="5080"/>
+          <wp:inline distT="0" distB="0" distL="0" distR="0" wp14:anchorId="1DFE73F2" wp14:editId="54BD1242">
+            <wp:extent cx="3003992" cy="1433015"/>
+            <wp:effectExtent l="0" t="0" r="6350" b="0"/>
             <wp:docPr id="6" name="Picture 1" descr="A grid of letters and numbers&#10;&#10;AI-generated content may be incorrect."/>
             <wp:cNvGraphicFramePr>
               <a:graphicFrameLocks xmlns:a="http://schemas.openxmlformats.org/drawingml/2006/main" noChangeAspect="1"/>
@@ -1969,7 +2056,7 @@
                   <pic:spPr bwMode="auto">
                     <a:xfrm>
                       <a:off x="0" y="0"/>
-                      <a:ext cx="3032919" cy="1725881"/>
+                      <a:ext cx="3045652" cy="1452888"/>
                     </a:xfrm>
                     <a:prstGeom prst="rect">
                       <a:avLst/>
@@ -2007,9 +2094,9 @@
           <w:noProof/>
         </w:rPr>
         <w:drawing>
-          <wp:inline distT="0" distB="0" distL="0" distR="0" wp14:anchorId="01213475" wp14:editId="65E9F108">
-            <wp:extent cx="1790065" cy="1240404"/>
-            <wp:effectExtent l="0" t="0" r="635" b="0"/>
+          <wp:inline distT="0" distB="0" distL="0" distR="0" wp14:anchorId="01213475" wp14:editId="78D8872B">
+            <wp:extent cx="1789706" cy="1057702"/>
+            <wp:effectExtent l="0" t="0" r="1270" b="9525"/>
             <wp:docPr id="1889266300" name="Picture 8" descr="A grid of numbers and letters&#10;&#10;AI-generated content may be incorrect."/>
             <wp:cNvGraphicFramePr>
               <a:graphicFrameLocks xmlns:a="http://schemas.openxmlformats.org/drawingml/2006/main" noChangeAspect="1"/>
@@ -2039,7 +2126,7 @@
                   <pic:spPr bwMode="auto">
                     <a:xfrm>
                       <a:off x="0" y="0"/>
-                      <a:ext cx="1799750" cy="1247115"/>
+                      <a:ext cx="1806109" cy="1067396"/>
                     </a:xfrm>
                     <a:prstGeom prst="rect">
                       <a:avLst/>
@@ -2074,9 +2161,9 @@
           <w:noProof/>
         </w:rPr>
         <w:drawing>
-          <wp:inline distT="0" distB="0" distL="0" distR="0" wp14:anchorId="71E624C6" wp14:editId="2E8A3B69">
-            <wp:extent cx="1522918" cy="1335819"/>
-            <wp:effectExtent l="0" t="0" r="1270" b="0"/>
+          <wp:inline distT="0" distB="0" distL="0" distR="0" wp14:anchorId="71E624C6" wp14:editId="0E86CCBA">
+            <wp:extent cx="1522446" cy="1173707"/>
+            <wp:effectExtent l="0" t="0" r="1905" b="7620"/>
             <wp:docPr id="1004678196" name="Picture 7" descr="A white grid with black letters&#10;&#10;AI-generated content may be incorrect."/>
             <wp:cNvGraphicFramePr>
               <a:graphicFrameLocks xmlns:a="http://schemas.openxmlformats.org/drawingml/2006/main" noChangeAspect="1"/>
@@ -2106,7 +2193,7 @@
                   <pic:spPr bwMode="auto">
                     <a:xfrm>
                       <a:off x="0" y="0"/>
-                      <a:ext cx="1536455" cy="1347693"/>
+                      <a:ext cx="1540600" cy="1187703"/>
                     </a:xfrm>
                     <a:prstGeom prst="rect">
                       <a:avLst/>
@@ -2150,6 +2237,7 @@
         <w:rPr>
           <w:rFonts w:eastAsia="Times New Roman"/>
         </w:rPr>
+        <w:lastRenderedPageBreak/>
         <w:t>Encoder</w:t>
       </w:r>
     </w:p>
@@ -2167,15 +2255,7 @@
           <w:rFonts w:eastAsia="Times New Roman"/>
           <w:noProof/>
         </w:rPr>
-        <w:t xml:space="preserve">In HTM systems, the role of the encoder is to transform raw input data numeric values, categorical data, or otherwise into Sparse Distributed Representations (SDRs), which are high-dimensional binary vectors with a small percentage of active (1) bits out of a large number of inactive (0) bits. This transformation is valuable as the HTM network processes SDRs exclusively, not merely normalizing the input form but also semantic relations encoding: similar inputs in the semantic sense result in SDRs that are highly overlapping in </w:t>
-      </w:r>
-      <w:r>
-        <w:rPr>
-          <w:rFonts w:eastAsia="Times New Roman"/>
-          <w:noProof/>
-        </w:rPr>
-        <w:lastRenderedPageBreak/>
-        <w:t>their active bits, making the network pattern detection and prediction feasible from partial similarity. The scalar encoder, which is the primary encoder of the HTM system, accomplishes this by mapping continuous scalar inputs into a fixed-length binary vector through a process of dividing the input range into overlapping buckets, with each bucket setting a specific set of bits. This method guarantees determinism any identical input will always produce the same SDR and provides a consistent dimensionality for all encoded outputs, which is important for effective pattern matching and learning within the HTM architecture. In addition, parameters like the total number of bits, the number of active bits, and overlap between successive buckets need to be fine-tuned in a very subtle balance between sensitivity and generalization so that the network can discriminate strongly between close but different inputs and, at the same time, recognize underlying trends and sequences.</w:t>
+        <w:t>In HTM systems, the role of the encoder is to transform raw input data numeric values, categorical data, or otherwise into Sparse Distributed Representations (SDRs), which are high-dimensional binary vectors with a small percentage of active (1) bits out of a large number of inactive (0) bits. This transformation is valuable as the HTM network processes SDRs exclusively, not merely normalizing the input form but also semantic relations encoding: similar inputs in the semantic sense result in SDRs that are highly overlapping in their active bits, making the network pattern detection and prediction feasible from partial similarity. The scalar encoder, which is the primary encoder of the HTM system, accomplishes this by mapping continuous scalar inputs into a fixed-length binary vector through a process of dividing the input range into overlapping buckets, with each bucket setting a specific set of bits. This method guarantees determinism any identical input will always produce the same SDR and provides a consistent dimensionality for all encoded outputs, which is important for effective pattern matching and learning within the HTM architecture. In addition, parameters like the total number of bits, the number of active bits, and overlap between successive buckets need to be fine-tuned in a very subtle balance between sensitivity and generalization so that the network can discriminate strongly between close but different inputs and, at the same time, recognize underlying trends and sequences.</w:t>
       </w:r>
     </w:p>
     <w:p/>
@@ -2232,14 +2312,14 @@
           <w:rFonts w:eastAsia="Times New Roman"/>
           <w:noProof/>
         </w:rPr>
-        <w:t xml:space="preserve">Hierarchical Temporal Memory (HTM) emulates neocortical processing by first converting raw input data into Sparse Distributed Representations (SDRs) using an encoder, typically a scalar encoder, which maps similar inputs to overlapping high-dimensional binary vectors. These SDRs are then fed into the Spatial Pooler, the network's initial layer, where each column computes an overlap score based on its synaptic connections to the active bits in the SDR. Through a competitive inhibition mechanism, only a fixed percentage of columns become active, ensuring consistent sparsity and effectively normalizing the input while preserving its semantic features. Building on this spatial representation, the Temporal Memory module captures the dynamic, sequential aspects of the data by forming hierarchical connections across multiple dendritic segments. This allows neurons to learn sequences, enter predictive states when recognizing familiar </w:t>
+        <w:t xml:space="preserve">Hierarchical Temporal Memory (HTM) emulates neocortical processing by first converting raw input data into Sparse Distributed Representations (SDRs) using an encoder, typically a scalar encoder, which maps similar inputs to overlapping high-dimensional binary vectors. These SDRs </w:t>
       </w:r>
       <w:r>
         <w:rPr>
           <w:rFonts w:eastAsia="Times New Roman"/>
           <w:noProof/>
         </w:rPr>
-        <w:t>patterns, and handle multiple potential future outcomes simultaneously. By integrating these spatial and temporal processes, HTM not only generates accurate predictions based on historical patterns but also adapts to new data, making it particularly effective for applications like natural language processing, anomaly detection, and sensor data analysis.</w:t>
+        <w:t>are then fed into the Spatial Pooler, the network's initial layer, where each column computes an overlap score based on its synaptic connections to the active bits in the SDR. Through a competitive inhibition mechanism, only a fixed percentage of columns become active, ensuring consistent sparsity and effectively normalizing the input while preserving its semantic features. Building on this spatial representation, the Temporal Memory module captures the dynamic, sequential aspects of the data by forming hierarchical connections across multiple dendritic segments. This allows neurons to learn sequences, enter predictive states when recognizing familiar patterns, and handle multiple potential future outcomes simultaneously. By integrating these spatial and temporal processes, HTM not only generates accurate predictions based on historical patterns but also adapts to new data, making it particularly effective for applications like natural language processing, anomaly detection, and sensor data analysis.</w:t>
       </w:r>
       <w:r>
         <w:rPr>
@@ -3262,6 +3342,7 @@
         <w:pStyle w:val="Heading2"/>
       </w:pPr>
       <w:r>
+        <w:lastRenderedPageBreak/>
         <w:t>How the project Works</w:t>
       </w:r>
     </w:p>
@@ -3282,11 +3363,7 @@
         <w:t xml:space="preserve"> </w:t>
       </w:r>
       <w:r>
-        <w:t xml:space="preserve">after which it loads the training data from JSON files containing carefully structured sequences (numeric or character-based) that are kept small to minimize execution time. Once ingested, the raw data is passed through a Scalar Encoder, which converts it into Sparse Distributed Representations (SDRs) while preserving the inherent semantic similarities and temporal </w:t>
-      </w:r>
-      <w:r>
-        <w:lastRenderedPageBreak/>
-        <w:t>ordering of the input. These SDRs then feed into the Spatial Pooler, where the system identifies and extracts stable, active columns using a competitive inhibition mechanism that ensures fixed sparsity, analogous to normalization in traditional neural networks. Building on this spatial representation, the Temporal Memory module learns the sequential dependencies over time by forming hierarchical connections between neurons, thereby enabling the model to predict future elements based on past patterns. After multiple training cycles, the model automatically transitions to testing mode by loading separate test sequences from JSON files, where the Predictor module forecasts the next elements in each sequence. These predictions are then compared to the actual test data, and accuracy metrics are calculated to evaluate the model’s performance. Finally, the project generates a comprehensive performance report, documenting the predictive accuracy and providing insights for further refinement, before concluding or preparing to process new data based on user input.</w:t>
+        <w:t>after which it loads the training data from JSON files containing carefully structured sequences (numeric or character-based) that are kept small to minimize execution time. Once ingested, the raw data is passed through a Scalar Encoder, which converts it into Sparse Distributed Representations (SDRs) while preserving the inherent semantic similarities and temporal ordering of the input. These SDRs then feed into the Spatial Pooler, where the system identifies and extracts stable, active columns using a competitive inhibition mechanism that ensures fixed sparsity, analogous to normalization in traditional neural networks. Building on this spatial representation, the Temporal Memory module learns the sequential dependencies over time by forming hierarchical connections between neurons, thereby enabling the model to predict future elements based on past patterns. After multiple training cycles, the model automatically transitions to testing mode by loading separate test sequences from JSON files, where the Predictor module forecasts the next elements in each sequence. These predictions are then compared to the actual test data, and accuracy metrics are calculated to evaluate the model’s performance. Finally, the project generates a comprehensive performance report, documenting the predictive accuracy and providing insights for further refinement, before concluding or preparing to process new data based on user input.</w:t>
       </w:r>
     </w:p>
     <w:p>
@@ -3309,16 +3386,19 @@
     <w:tbl>
       <w:tblPr>
         <w:tblStyle w:val="TableGrid"/>
-        <w:tblW w:w="0" w:type="auto"/>
+        <w:tblW w:w="4887" w:type="dxa"/>
         <w:tblLook w:val="04A0" w:firstRow="1" w:lastRow="0" w:firstColumn="1" w:lastColumn="0" w:noHBand="0" w:noVBand="1"/>
       </w:tblPr>
       <w:tblGrid>
-        <w:gridCol w:w="4856"/>
+        <w:gridCol w:w="4887"/>
       </w:tblGrid>
       <w:tr>
+        <w:trPr>
+          <w:trHeight w:val="298"/>
+        </w:trPr>
         <w:tc>
           <w:tcPr>
-            <w:tcW w:w="4856" w:type="dxa"/>
+            <w:tcW w:w="4887" w:type="dxa"/>
           </w:tcPr>
           <w:p>
             <w:pPr>
@@ -3338,9 +3418,12 @@
         </w:tc>
       </w:tr>
       <w:tr>
+        <w:trPr>
+          <w:trHeight w:val="3047"/>
+        </w:trPr>
         <w:tc>
           <w:tcPr>
-            <w:tcW w:w="4856" w:type="dxa"/>
+            <w:tcW w:w="4887" w:type="dxa"/>
           </w:tcPr>
           <w:p>
             <w:pPr>
@@ -3566,19 +3649,31 @@
         </w:rPr>
       </w:pPr>
     </w:p>
+    <w:p>
+      <w:pPr>
+        <w:jc w:val="both"/>
+        <w:rPr>
+          <w:rFonts w:eastAsia="Times New Roman"/>
+          <w:noProof/>
+        </w:rPr>
+      </w:pPr>
+    </w:p>
     <w:tbl>
       <w:tblPr>
         <w:tblStyle w:val="TableGrid"/>
-        <w:tblW w:w="0" w:type="auto"/>
+        <w:tblW w:w="4973" w:type="dxa"/>
         <w:tblLook w:val="04A0" w:firstRow="1" w:lastRow="0" w:firstColumn="1" w:lastColumn="0" w:noHBand="0" w:noVBand="1"/>
       </w:tblPr>
       <w:tblGrid>
-        <w:gridCol w:w="4856"/>
+        <w:gridCol w:w="4973"/>
       </w:tblGrid>
       <w:tr>
+        <w:trPr>
+          <w:trHeight w:val="166"/>
+        </w:trPr>
         <w:tc>
           <w:tcPr>
-            <w:tcW w:w="4856" w:type="dxa"/>
+            <w:tcW w:w="4973" w:type="dxa"/>
           </w:tcPr>
           <w:p>
             <w:pPr>
@@ -3598,9 +3693,12 @@
         </w:tc>
       </w:tr>
       <w:tr>
+        <w:trPr>
+          <w:trHeight w:val="1222"/>
+        </w:trPr>
         <w:tc>
           <w:tcPr>
-            <w:tcW w:w="4856" w:type="dxa"/>
+            <w:tcW w:w="4973" w:type="dxa"/>
           </w:tcPr>
           <w:p>
             <w:pPr>
@@ -3736,171 +3834,10 @@
               <w:t>inputBits)</w:t>
             </w:r>
           </w:p>
-        </w:tc>
-      </w:tr>
-    </w:tbl>
-    <w:p>
-      <w:pPr>
-        <w:jc w:val="both"/>
-        <w:rPr>
-          <w:rFonts w:eastAsia="Times New Roman"/>
-          <w:noProof/>
-        </w:rPr>
-      </w:pPr>
-    </w:p>
-    <w:tbl>
-      <w:tblPr>
-        <w:tblStyle w:val="TableGrid"/>
-        <w:tblW w:w="0" w:type="auto"/>
-        <w:tblLook w:val="04A0" w:firstRow="1" w:lastRow="0" w:firstColumn="1" w:lastColumn="0" w:noHBand="0" w:noVBand="1"/>
-      </w:tblPr>
-      <w:tblGrid>
-        <w:gridCol w:w="4856"/>
-      </w:tblGrid>
-      <w:tr>
-        <w:tc>
-          <w:tcPr>
-            <w:tcW w:w="4856" w:type="dxa"/>
-          </w:tcPr>
-          <w:p>
-            <w:pPr>
-              <w:rPr>
-                <w:b/>
-                <w:bCs/>
-              </w:rPr>
-            </w:pPr>
-            <w:r>
-              <w:rPr>
-                <w:b/>
-                <w:bCs/>
-              </w:rPr>
-              <w:t>Program</w:t>
-            </w:r>
-            <w:r>
-              <w:rPr>
-                <w:b/>
-                <w:bCs/>
-              </w:rPr>
-              <w:t>.cs</w:t>
-            </w:r>
-          </w:p>
-        </w:tc>
-      </w:tr>
-      <w:tr>
-        <w:tc>
-          <w:tcPr>
-            <w:tcW w:w="4856" w:type="dxa"/>
-          </w:tcPr>
           <w:p>
             <w:pPr>
               <w:jc w:val="left"/>
-              <w:rPr>
-                <w:b/>
-                <w:bCs/>
-              </w:rPr>
             </w:pPr>
-            <w:r>
-              <w:rPr>
-                <w:b/>
-                <w:bCs/>
-              </w:rPr>
-              <w:t>Line</w:t>
-            </w:r>
-            <w:r>
-              <w:rPr>
-                <w:b/>
-                <w:bCs/>
-              </w:rPr>
-              <w:t>s</w:t>
-            </w:r>
-            <w:r>
-              <w:rPr>
-                <w:b/>
-                <w:bCs/>
-              </w:rPr>
-              <w:t>:</w:t>
-            </w:r>
-            <w:r>
-              <w:rPr>
-                <w:b/>
-                <w:bCs/>
-              </w:rPr>
-              <w:t xml:space="preserve"> </w:t>
-            </w:r>
-            <w:r>
-              <w:rPr>
-                <w:b/>
-                <w:bCs/>
-              </w:rPr>
-              <w:t>166</w:t>
-            </w:r>
-            <w:r>
-              <w:rPr>
-                <w:b/>
-                <w:bCs/>
-              </w:rPr>
-              <w:t>-</w:t>
-            </w:r>
-            <w:r>
-              <w:rPr>
-                <w:b/>
-                <w:bCs/>
-              </w:rPr>
-              <w:t>187</w:t>
-            </w:r>
-          </w:p>
-          <w:p>
-            <w:pPr>
-              <w:jc w:val="left"/>
-              <w:rPr>
-                <w:color w:val="4472C4" w:themeColor="accent1"/>
-              </w:rPr>
-            </w:pPr>
-            <w:r>
-              <w:rPr>
-                <w:color w:val="4472C4" w:themeColor="accent1"/>
-              </w:rPr>
-              <w:t xml:space="preserve">private static string </w:t>
-            </w:r>
-            <w:r>
-              <w:t>PredictElement (</w:t>
-            </w:r>
-            <w:r>
-              <w:rPr>
-                <w:color w:val="4472C4" w:themeColor="accent1"/>
-              </w:rPr>
-              <w:t xml:space="preserve">Predictor </w:t>
-            </w:r>
-            <w:r>
-              <w:t>predictor</w:t>
-            </w:r>
-            <w:r>
-              <w:rPr>
-                <w:color w:val="4472C4" w:themeColor="accent1"/>
-              </w:rPr>
-              <w:t xml:space="preserve">, int </w:t>
-            </w:r>
-            <w:r>
-              <w:t>current</w:t>
-            </w:r>
-            <w:r>
-              <w:rPr>
-                <w:color w:val="4472C4" w:themeColor="accent1"/>
-              </w:rPr>
-              <w:t xml:space="preserve">, int </w:t>
-            </w:r>
-            <w:r>
-              <w:t>next</w:t>
-            </w:r>
-            <w:r>
-              <w:rPr>
-                <w:color w:val="4472C4" w:themeColor="accent1"/>
-              </w:rPr>
-              <w:t xml:space="preserve">, ref int </w:t>
-            </w:r>
-            <w:r>
-              <w:t>matchCount)</w:t>
-            </w:r>
           </w:p>
           <w:p>
             <w:pPr>
@@ -3910,6 +3847,188 @@
           <w:p>
             <w:pPr>
               <w:jc w:val="left"/>
+            </w:pPr>
+          </w:p>
+        </w:tc>
+      </w:tr>
+    </w:tbl>
+    <w:p>
+      <w:pPr>
+        <w:jc w:val="both"/>
+        <w:rPr>
+          <w:rFonts w:eastAsia="Times New Roman"/>
+          <w:noProof/>
+        </w:rPr>
+      </w:pPr>
+    </w:p>
+    <w:tbl>
+      <w:tblPr>
+        <w:tblStyle w:val="TableGrid"/>
+        <w:tblW w:w="4887" w:type="dxa"/>
+        <w:tblLook w:val="04A0" w:firstRow="1" w:lastRow="0" w:firstColumn="1" w:lastColumn="0" w:noHBand="0" w:noVBand="1"/>
+      </w:tblPr>
+      <w:tblGrid>
+        <w:gridCol w:w="4887"/>
+      </w:tblGrid>
+      <w:tr>
+        <w:trPr>
+          <w:trHeight w:val="307"/>
+        </w:trPr>
+        <w:tc>
+          <w:tcPr>
+            <w:tcW w:w="4887" w:type="dxa"/>
+          </w:tcPr>
+          <w:p>
+            <w:pPr>
+              <w:rPr>
+                <w:b/>
+                <w:bCs/>
+              </w:rPr>
+            </w:pPr>
+            <w:r>
+              <w:rPr>
+                <w:b/>
+                <w:bCs/>
+              </w:rPr>
+              <w:t>Program</w:t>
+            </w:r>
+            <w:r>
+              <w:rPr>
+                <w:b/>
+                <w:bCs/>
+              </w:rPr>
+              <w:t>.cs</w:t>
+            </w:r>
+          </w:p>
+        </w:tc>
+      </w:tr>
+      <w:tr>
+        <w:trPr>
+          <w:trHeight w:val="2501"/>
+        </w:trPr>
+        <w:tc>
+          <w:tcPr>
+            <w:tcW w:w="4887" w:type="dxa"/>
+          </w:tcPr>
+          <w:p>
+            <w:pPr>
+              <w:jc w:val="left"/>
+              <w:rPr>
+                <w:b/>
+                <w:bCs/>
+              </w:rPr>
+            </w:pPr>
+            <w:r>
+              <w:rPr>
+                <w:b/>
+                <w:bCs/>
+              </w:rPr>
+              <w:t>Line</w:t>
+            </w:r>
+            <w:r>
+              <w:rPr>
+                <w:b/>
+                <w:bCs/>
+              </w:rPr>
+              <w:t>s</w:t>
+            </w:r>
+            <w:r>
+              <w:rPr>
+                <w:b/>
+                <w:bCs/>
+              </w:rPr>
+              <w:t>:</w:t>
+            </w:r>
+            <w:r>
+              <w:rPr>
+                <w:b/>
+                <w:bCs/>
+              </w:rPr>
+              <w:t xml:space="preserve"> </w:t>
+            </w:r>
+            <w:r>
+              <w:rPr>
+                <w:b/>
+                <w:bCs/>
+              </w:rPr>
+              <w:t>166</w:t>
+            </w:r>
+            <w:r>
+              <w:rPr>
+                <w:b/>
+                <w:bCs/>
+              </w:rPr>
+              <w:t>-</w:t>
+            </w:r>
+            <w:r>
+              <w:rPr>
+                <w:b/>
+                <w:bCs/>
+              </w:rPr>
+              <w:t>187</w:t>
+            </w:r>
+          </w:p>
+          <w:p>
+            <w:pPr>
+              <w:jc w:val="left"/>
+              <w:rPr>
+                <w:color w:val="4472C4" w:themeColor="accent1"/>
+              </w:rPr>
+            </w:pPr>
+            <w:r>
+              <w:rPr>
+                <w:color w:val="4472C4" w:themeColor="accent1"/>
+              </w:rPr>
+              <w:t xml:space="preserve">private static string </w:t>
+            </w:r>
+            <w:r>
+              <w:t>PredictElement (</w:t>
+            </w:r>
+            <w:r>
+              <w:rPr>
+                <w:color w:val="4472C4" w:themeColor="accent1"/>
+              </w:rPr>
+              <w:t xml:space="preserve">Predictor </w:t>
+            </w:r>
+            <w:r>
+              <w:t>predictor</w:t>
+            </w:r>
+            <w:r>
+              <w:rPr>
+                <w:color w:val="4472C4" w:themeColor="accent1"/>
+              </w:rPr>
+              <w:t xml:space="preserve">, int </w:t>
+            </w:r>
+            <w:r>
+              <w:t>current</w:t>
+            </w:r>
+            <w:r>
+              <w:rPr>
+                <w:color w:val="4472C4" w:themeColor="accent1"/>
+              </w:rPr>
+              <w:t xml:space="preserve">, int </w:t>
+            </w:r>
+            <w:r>
+              <w:t>next</w:t>
+            </w:r>
+            <w:r>
+              <w:rPr>
+                <w:color w:val="4472C4" w:themeColor="accent1"/>
+              </w:rPr>
+              <w:t xml:space="preserve">, ref int </w:t>
+            </w:r>
+            <w:r>
+              <w:t>matchCount)</w:t>
+            </w:r>
+          </w:p>
+          <w:p>
+            <w:pPr>
+              <w:jc w:val="left"/>
+            </w:pPr>
+          </w:p>
+          <w:p>
+            <w:pPr>
+              <w:jc w:val="left"/>
               <w:rPr>
                 <w:b/>
                 <w:bCs/>
@@ -4017,6 +4136,15 @@
         </w:rPr>
       </w:pPr>
     </w:p>
+    <w:p>
+      <w:pPr>
+        <w:jc w:val="both"/>
+        <w:rPr>
+          <w:rFonts w:eastAsia="Times New Roman"/>
+          <w:noProof/>
+        </w:rPr>
+      </w:pPr>
+    </w:p>
     <w:tbl>
       <w:tblPr>
         <w:tblStyle w:val="TableGrid"/>
@@ -4024,12 +4152,15 @@
         <w:tblLook w:val="04A0" w:firstRow="1" w:lastRow="0" w:firstColumn="1" w:lastColumn="0" w:noHBand="0" w:noVBand="1"/>
       </w:tblPr>
       <w:tblGrid>
-        <w:gridCol w:w="4856"/>
+        <w:gridCol w:w="4834"/>
       </w:tblGrid>
       <w:tr>
+        <w:trPr>
+          <w:trHeight w:val="363"/>
+        </w:trPr>
         <w:tc>
           <w:tcPr>
-            <w:tcW w:w="4856" w:type="dxa"/>
+            <w:tcW w:w="4834" w:type="dxa"/>
           </w:tcPr>
           <w:p>
             <w:pPr>
@@ -4049,9 +4180,12 @@
         </w:tc>
       </w:tr>
       <w:tr>
+        <w:trPr>
+          <w:trHeight w:val="1848"/>
+        </w:trPr>
         <w:tc>
           <w:tcPr>
-            <w:tcW w:w="4856" w:type="dxa"/>
+            <w:tcW w:w="4834" w:type="dxa"/>
           </w:tcPr>
           <w:p>
             <w:pPr>
@@ -4223,20 +4357,109 @@
     </w:p>
     <w:p>
       <w:pPr>
-        <w:ind w:firstLine="720"/>
         <w:jc w:val="both"/>
+      </w:pPr>
+      <w:r>
         <w:rPr>
           <w:rFonts w:eastAsia="Times New Roman"/>
           <w:noProof/>
         </w:rPr>
-      </w:pPr>
-      <w:r>
-        <w:rPr>
-          <w:rFonts w:eastAsia="Times New Roman"/>
-          <w:noProof/>
-        </w:rPr>
         <w:t xml:space="preserve">In this project, we explored two approaches to multi-sequence learning by repeatedly running experiments across various datasets. To reduce execution time, we deliberately limited the size of each dataset and the number of sequences processed. </w:t>
       </w:r>
+      <w:r>
+        <w:t>Accuracy is calculated after testing by “Accuracy = of correct next</w:t>
+      </w:r>
+      <w:r>
+        <w:noBreakHyphen/>
+        <w:t xml:space="preserve">step predictions ÷ of predictions attempted × 100 ”. In the project code : “ accuracy = (double)matchCount / predictions * 100 ”. Where prediction is the number of opportunities to guess the </w:t>
+      </w:r>
+      <w:r>
+        <w:rPr>
+          <w:i/>
+          <w:iCs/>
+        </w:rPr>
+        <w:t>next</w:t>
+      </w:r>
+      <w:r>
+        <w:t xml:space="preserve"> symbol in the test sequence and matchCount is incremented every time the element predicted by the HTM classifier for time equals the true element.</w:t>
+      </w:r>
+      <w:r>
+        <w:t xml:space="preserve"> </w:t>
+      </w:r>
+      <w:r>
+        <w:t>We have learned four sequences and  we have tested four sequences. We did not take any subsequences. For time consuming, we did not take any subsequences also we used small sequence.</w:t>
+      </w:r>
+      <w:r>
+        <w:t xml:space="preserve"> </w:t>
+      </w:r>
+    </w:p>
+    <w:p>
+      <w:pPr>
+        <w:jc w:val="both"/>
+      </w:pPr>
+      <w:r>
+        <w:t xml:space="preserve"> </w:t>
+      </w:r>
+    </w:p>
+    <w:p>
+      <w:pPr>
+        <w:jc w:val="both"/>
+      </w:pPr>
+    </w:p>
+    <w:p>
+      <w:pPr>
+        <w:jc w:val="both"/>
+      </w:pPr>
+    </w:p>
+    <w:p>
+      <w:pPr>
+        <w:jc w:val="both"/>
+      </w:pPr>
+    </w:p>
+    <w:p>
+      <w:pPr>
+        <w:jc w:val="both"/>
+      </w:pPr>
+    </w:p>
+    <w:p>
+      <w:pPr>
+        <w:jc w:val="both"/>
+      </w:pPr>
+    </w:p>
+    <w:p>
+      <w:pPr>
+        <w:jc w:val="both"/>
+      </w:pPr>
+    </w:p>
+    <w:p>
+      <w:pPr>
+        <w:jc w:val="both"/>
+      </w:pPr>
+    </w:p>
+    <w:p>
+      <w:pPr>
+        <w:jc w:val="both"/>
+      </w:pPr>
+    </w:p>
+    <w:p>
+      <w:pPr>
+        <w:jc w:val="both"/>
+      </w:pPr>
+    </w:p>
+    <w:p>
+      <w:pPr>
+        <w:jc w:val="both"/>
+      </w:pPr>
+    </w:p>
+    <w:p>
+      <w:pPr>
+        <w:jc w:val="both"/>
+      </w:pPr>
+    </w:p>
+    <w:p>
+      <w:pPr>
+        <w:jc w:val="both"/>
+      </w:pPr>
     </w:p>
     <w:p>
       <w:pPr>
@@ -4248,24 +4471,14 @@
           <w:noProof/>
         </w:rPr>
       </w:pPr>
-    </w:p>
-    <w:p>
-      <w:pPr>
-        <w:jc w:val="both"/>
+      <w:r>
         <w:rPr>
           <w:rFonts w:eastAsia="Times New Roman"/>
           <w:b/>
           <w:bCs/>
           <w:noProof/>
         </w:rPr>
-      </w:pPr>
-      <w:r>
-        <w:rPr>
-          <w:rFonts w:eastAsia="Times New Roman"/>
-          <w:b/>
-          <w:bCs/>
-          <w:noProof/>
-        </w:rPr>
+        <w:lastRenderedPageBreak/>
         <w:t>Result for Cancer Prediction</w:t>
       </w:r>
     </w:p>
@@ -4321,9 +4534,9 @@
           <w:bdr w:val="none" w:sz="0" w:space="0" w:color="auto" w:frame="1"/>
         </w:rPr>
         <w:drawing>
-          <wp:inline distT="0" distB="0" distL="0" distR="0" wp14:anchorId="0C361474" wp14:editId="1DB1E550">
-            <wp:extent cx="2812551" cy="4354045"/>
-            <wp:effectExtent l="0" t="0" r="6985" b="8890"/>
+          <wp:inline distT="0" distB="0" distL="0" distR="0" wp14:anchorId="0C361474" wp14:editId="1DA2DFA6">
+            <wp:extent cx="2811145" cy="5281684"/>
+            <wp:effectExtent l="0" t="0" r="8255" b="0"/>
             <wp:docPr id="950825137" name="Picture 14"/>
             <wp:cNvGraphicFramePr>
               <a:graphicFrameLocks xmlns:a="http://schemas.openxmlformats.org/drawingml/2006/main" noChangeAspect="1"/>
@@ -4352,7 +4565,7 @@
                   <pic:spPr bwMode="auto">
                     <a:xfrm>
                       <a:off x="0" y="0"/>
-                      <a:ext cx="2812551" cy="4354045"/>
+                      <a:ext cx="2859107" cy="5371797"/>
                     </a:xfrm>
                     <a:prstGeom prst="rect">
                       <a:avLst/>
@@ -4396,6 +4609,81 @@
     </w:p>
     <w:p>
       <w:pPr>
+        <w:jc w:val="left"/>
+      </w:pPr>
+    </w:p>
+    <w:p>
+      <w:pPr>
+        <w:jc w:val="left"/>
+      </w:pPr>
+    </w:p>
+    <w:p>
+      <w:pPr>
+        <w:jc w:val="left"/>
+      </w:pPr>
+    </w:p>
+    <w:p>
+      <w:pPr>
+        <w:jc w:val="left"/>
+      </w:pPr>
+    </w:p>
+    <w:p>
+      <w:pPr>
+        <w:jc w:val="left"/>
+      </w:pPr>
+    </w:p>
+    <w:p>
+      <w:pPr>
+        <w:jc w:val="left"/>
+      </w:pPr>
+    </w:p>
+    <w:p>
+      <w:pPr>
+        <w:jc w:val="left"/>
+      </w:pPr>
+    </w:p>
+    <w:p>
+      <w:pPr>
+        <w:jc w:val="left"/>
+      </w:pPr>
+    </w:p>
+    <w:p>
+      <w:pPr>
+        <w:jc w:val="left"/>
+      </w:pPr>
+    </w:p>
+    <w:p>
+      <w:pPr>
+        <w:jc w:val="left"/>
+      </w:pPr>
+    </w:p>
+    <w:p>
+      <w:pPr>
+        <w:jc w:val="left"/>
+      </w:pPr>
+    </w:p>
+    <w:p>
+      <w:pPr>
+        <w:jc w:val="left"/>
+      </w:pPr>
+    </w:p>
+    <w:p>
+      <w:pPr>
+        <w:jc w:val="left"/>
+      </w:pPr>
+    </w:p>
+    <w:p>
+      <w:pPr>
+        <w:jc w:val="left"/>
+      </w:pPr>
+    </w:p>
+    <w:p>
+      <w:pPr>
+        <w:jc w:val="left"/>
+      </w:pPr>
+    </w:p>
+    <w:p>
+      <w:pPr>
         <w:jc w:val="both"/>
         <w:rPr>
           <w:rFonts w:eastAsia="Times New Roman"/>
@@ -4465,10 +4753,9 @@
           <w:color w:val="000000"/>
           <w:bdr w:val="none" w:sz="0" w:space="0" w:color="auto" w:frame="1"/>
         </w:rPr>
-        <w:lastRenderedPageBreak/>
         <w:drawing>
-          <wp:inline distT="0" distB="0" distL="0" distR="0" wp14:anchorId="51E4DEAD" wp14:editId="1F9275D3">
-            <wp:extent cx="2996335" cy="4615976"/>
+          <wp:inline distT="0" distB="0" distL="0" distR="0" wp14:anchorId="51E4DEAD" wp14:editId="6B3F36A4">
+            <wp:extent cx="2995295" cy="4674358"/>
             <wp:effectExtent l="0" t="0" r="0" b="0"/>
             <wp:docPr id="494123128" name="Picture 15"/>
             <wp:cNvGraphicFramePr>
@@ -4498,7 +4785,7 @@
                   <pic:spPr bwMode="auto">
                     <a:xfrm>
                       <a:off x="0" y="0"/>
-                      <a:ext cx="2996335" cy="4615976"/>
+                      <a:ext cx="3012731" cy="4701569"/>
                     </a:xfrm>
                     <a:prstGeom prst="rect">
                       <a:avLst/>
@@ -4574,66 +4861,20 @@
         <w:rPr>
           <w:rFonts w:eastAsia="Times New Roman"/>
         </w:rPr>
-        <w:t xml:space="preserve"> files to increase efficiency and accuracy when compared to manual approaches. Our findings demonstrate the technique's application across a wide range of businesses, from power consumption forecasting to cancer prediction. Through testing, we proved the effectiveness of our technique in properly predicting sequences, confirming its value for a wide range of applications. In essence, our study not only explains the principles of Multisequence Learning, but it also pioneers a streamlined way for propelling sequence prediction toward speedier and more reliable outcomes, supporting innovation and development in predictive modeling paradigms.</w:t>
-      </w:r>
-    </w:p>
-    <w:p>
-      <w:pPr>
-        <w:jc w:val="both"/>
+        <w:t xml:space="preserve"> files to increase efficiency and accuracy when compared to manual approaches. Our findings demonstrate the technique's application across a wide range of businesses, from power consumption forecasting to cancer prediction. Through testing, we proved the effectiveness of our technique in </w:t>
+      </w:r>
+      <w:r>
         <w:rPr>
           <w:rFonts w:eastAsia="Times New Roman"/>
         </w:rPr>
-      </w:pPr>
-    </w:p>
-    <w:p>
-      <w:pPr>
-        <w:jc w:val="both"/>
+        <w:t>accurately predicting</w:t>
+      </w:r>
+      <w:r>
         <w:rPr>
           <w:rFonts w:eastAsia="Times New Roman"/>
         </w:rPr>
-      </w:pPr>
-    </w:p>
-    <w:p>
-      <w:pPr>
-        <w:jc w:val="both"/>
-        <w:rPr>
-          <w:rFonts w:eastAsia="Times New Roman"/>
-        </w:rPr>
-      </w:pPr>
-    </w:p>
-    <w:p>
-      <w:pPr>
-        <w:jc w:val="both"/>
-        <w:rPr>
-          <w:rFonts w:eastAsia="Times New Roman"/>
-        </w:rPr>
-      </w:pPr>
-    </w:p>
-    <w:p>
-      <w:pPr>
-        <w:jc w:val="both"/>
-        <w:rPr>
-          <w:rFonts w:eastAsia="Times New Roman"/>
-        </w:rPr>
-      </w:pPr>
-    </w:p>
-    <w:p>
-      <w:pPr>
-        <w:jc w:val="both"/>
-        <w:rPr>
-          <w:rFonts w:eastAsia="Times New Roman"/>
-          <w:noProof/>
-        </w:rPr>
-      </w:pPr>
-    </w:p>
-    <w:p>
-      <w:pPr>
-        <w:jc w:val="both"/>
-        <w:rPr>
-          <w:rFonts w:eastAsia="Times New Roman"/>
-          <w:noProof/>
-        </w:rPr>
-      </w:pPr>
+        <w:t xml:space="preserve"> sequences, confirming its value for a wide range of applications. In essence, our study not only explains the principles of Multisequence Learning, but it also pioneers a streamlined way for propelling sequence prediction toward speedier and more reliable outcomes, supporting innovation and development in predictive modeling paradigms.</w:t>
+      </w:r>
     </w:p>
     <w:p>
       <w:pPr>
@@ -8598,6 +8839,7 @@
   <w:style w:type="character" w:default="1" w:styleId="DefaultParagraphFont">
     <w:name w:val="Default Paragraph Font"/>
     <w:uiPriority w:val="1"/>
+    <w:semiHidden/>
     <w:unhideWhenUsed/>
   </w:style>
   <w:style w:type="table" w:default="1" w:styleId="TableNormal">

</xml_diff>